<commit_message>
Actualización del documento y eliminación de archivo temporal
</commit_message>
<xml_diff>
--- a/TALLER SCRUM SEMANA 7.docx
+++ b/TALLER SCRUM SEMANA 7.docx
@@ -5,24 +5,62 @@
     <w:p>
       <w:pPr>
         <w:rPr>
+          <w:b/>
+          <w:bCs/>
           <w:lang w:val="es-MX"/>
         </w:rPr>
       </w:pPr>
       <w:r>
         <w:rPr>
-          <w:lang w:val="es-MX"/>
-        </w:rPr>
-        <w:t xml:space="preserve">Nombre del equipo: La iglesia de las empanadas </w:t>
+          <w:b/>
+          <w:bCs/>
+          <w:lang w:val="es-MX"/>
+        </w:rPr>
+        <w:t>A LA ORDEN</w:t>
       </w:r>
     </w:p>
     <w:p>
       <w:pPr>
         <w:rPr>
+          <w:b/>
+          <w:bCs/>
+          <w:lang w:val="es-MX"/>
+        </w:rPr>
+      </w:pPr>
+    </w:p>
+    <w:p>
+      <w:pPr>
+        <w:rPr>
           <w:lang w:val="es-MX"/>
         </w:rPr>
       </w:pPr>
       <w:r>
         <w:rPr>
+          <w:b/>
+          <w:bCs/>
+          <w:lang w:val="es-MX"/>
+        </w:rPr>
+        <w:t>Nombre del equipo:</w:t>
+      </w:r>
+      <w:r>
+        <w:rPr>
+          <w:lang w:val="es-MX"/>
+        </w:rPr>
+        <w:t xml:space="preserve"> La iglesia de las empanadas </w:t>
+      </w:r>
+    </w:p>
+    <w:p>
+      <w:pPr>
+        <w:rPr>
+          <w:b/>
+          <w:bCs/>
+          <w:lang w:val="es-MX"/>
+        </w:rPr>
+      </w:pPr>
+      <w:r>
+        <w:rPr>
+          <w:b/>
+          <w:bCs/>
           <w:lang w:val="es-MX"/>
         </w:rPr>
         <w:t xml:space="preserve">ROLES: </w:t>
@@ -36,9 +74,17 @@
       </w:pPr>
       <w:r>
         <w:rPr>
-          <w:lang w:val="es-MX"/>
-        </w:rPr>
-        <w:t>Producto Owner: Juan Camilo Chica</w:t>
+          <w:b/>
+          <w:bCs/>
+          <w:lang w:val="es-MX"/>
+        </w:rPr>
+        <w:t>Producto Owner:</w:t>
+      </w:r>
+      <w:r>
+        <w:rPr>
+          <w:lang w:val="es-MX"/>
+        </w:rPr>
+        <w:t xml:space="preserve"> Juan Camilo Chica</w:t>
       </w:r>
     </w:p>
     <w:p>
@@ -49,9 +95,17 @@
       </w:pPr>
       <w:r>
         <w:rPr>
-          <w:lang w:val="es-MX"/>
-        </w:rPr>
-        <w:t>Scrum Máster: Luis Miguel Alvares</w:t>
+          <w:b/>
+          <w:bCs/>
+          <w:lang w:val="es-MX"/>
+        </w:rPr>
+        <w:t>Scrum Máster:</w:t>
+      </w:r>
+      <w:r>
+        <w:rPr>
+          <w:lang w:val="es-MX"/>
+        </w:rPr>
+        <w:t xml:space="preserve"> Luis Miguel Alvares</w:t>
       </w:r>
     </w:p>
     <w:p>
@@ -62,9 +116,68 @@
       </w:pPr>
       <w:r>
         <w:rPr>
-          <w:lang w:val="es-MX"/>
-        </w:rPr>
-        <w:t>Desarrollo Team: Sebastian Bravo</w:t>
+          <w:b/>
+          <w:bCs/>
+          <w:lang w:val="es-MX"/>
+        </w:rPr>
+        <w:t>Desarrollo Team:</w:t>
+      </w:r>
+      <w:r>
+        <w:rPr>
+          <w:lang w:val="es-MX"/>
+        </w:rPr>
+        <w:t xml:space="preserve"> </w:t>
+      </w:r>
+      <w:proofErr w:type="spellStart"/>
+      <w:r>
+        <w:rPr>
+          <w:lang w:val="es-MX"/>
+        </w:rPr>
+        <w:t>Sebastian</w:t>
+      </w:r>
+      <w:proofErr w:type="spellEnd"/>
+      <w:r>
+        <w:rPr>
+          <w:lang w:val="es-MX"/>
+        </w:rPr>
+        <w:t xml:space="preserve"> Bravo</w:t>
+      </w:r>
+    </w:p>
+    <w:p>
+      <w:pPr>
+        <w:rPr>
+          <w:b/>
+          <w:bCs/>
+          <w:lang w:val="es-MX"/>
+        </w:rPr>
+      </w:pPr>
+    </w:p>
+    <w:p>
+      <w:pPr>
+        <w:rPr>
+          <w:b/>
+          <w:bCs/>
+          <w:u w:val="single"/>
+          <w:lang w:val="es-MX"/>
+        </w:rPr>
+      </w:pPr>
+      <w:proofErr w:type="spellStart"/>
+      <w:r>
+        <w:rPr>
+          <w:b/>
+          <w:bCs/>
+          <w:lang w:val="es-MX"/>
+        </w:rPr>
+        <w:t>Product</w:t>
+      </w:r>
+      <w:proofErr w:type="spellEnd"/>
+      <w:r>
+        <w:rPr>
+          <w:b/>
+          <w:bCs/>
+          <w:lang w:val="es-MX"/>
+        </w:rPr>
+        <w:t xml:space="preserve"> Backlog:</w:t>
       </w:r>
     </w:p>
     <w:p>

</xml_diff>

<commit_message>
Funciones y actividades por rol
</commit_message>
<xml_diff>
--- a/TALLER SCRUM SEMANA 7.docx
+++ b/TALLER SCRUM SEMANA 7.docx
@@ -126,21 +126,7 @@
         <w:rPr>
           <w:lang w:val="es-MX"/>
         </w:rPr>
-        <w:t xml:space="preserve"> </w:t>
-      </w:r>
-      <w:proofErr w:type="spellStart"/>
-      <w:r>
-        <w:rPr>
-          <w:lang w:val="es-MX"/>
-        </w:rPr>
-        <w:t>Sebastian</w:t>
-      </w:r>
-      <w:proofErr w:type="spellEnd"/>
-      <w:r>
-        <w:rPr>
-          <w:lang w:val="es-MX"/>
-        </w:rPr>
-        <w:t xml:space="preserve"> Bravo</w:t>
+        <w:t xml:space="preserve"> Sebastian Bravo</w:t>
       </w:r>
     </w:p>
     <w:p>
@@ -151,6 +137,656 @@
           <w:lang w:val="es-MX"/>
         </w:rPr>
       </w:pPr>
+    </w:p>
+    <w:p>
+      <w:pPr>
+        <w:rPr>
+          <w:b/>
+          <w:bCs/>
+          <w:lang w:val="es-MX"/>
+        </w:rPr>
+      </w:pPr>
+      <w:r>
+        <w:rPr>
+          <w:b/>
+          <w:bCs/>
+          <w:lang w:val="es-MX"/>
+        </w:rPr>
+        <w:t>Funciones:</w:t>
+      </w:r>
+      <w:r>
+        <w:rPr>
+          <w:b/>
+          <w:bCs/>
+          <w:lang w:val="es-MX"/>
+        </w:rPr>
+        <w:br/>
+        <w:t>Usuario / Cliente:</w:t>
+      </w:r>
+    </w:p>
+    <w:p>
+      <w:pPr>
+        <w:pStyle w:val="Prrafodelista"/>
+        <w:numPr>
+          <w:ilvl w:val="0"/>
+          <w:numId w:val="1"/>
+        </w:numPr>
+        <w:rPr>
+          <w:lang w:val="es-MX"/>
+        </w:rPr>
+      </w:pPr>
+      <w:r>
+        <w:rPr>
+          <w:lang w:val="es-MX"/>
+        </w:rPr>
+        <w:t>Crear cuenta de usuario</w:t>
+      </w:r>
+    </w:p>
+    <w:p>
+      <w:pPr>
+        <w:pStyle w:val="Prrafodelista"/>
+        <w:numPr>
+          <w:ilvl w:val="0"/>
+          <w:numId w:val="1"/>
+        </w:numPr>
+        <w:rPr>
+          <w:lang w:val="es-MX"/>
+        </w:rPr>
+      </w:pPr>
+      <w:r>
+        <w:rPr>
+          <w:lang w:val="es-MX"/>
+        </w:rPr>
+        <w:t>Iniciar sesión</w:t>
+      </w:r>
+    </w:p>
+    <w:p>
+      <w:pPr>
+        <w:pStyle w:val="Prrafodelista"/>
+        <w:numPr>
+          <w:ilvl w:val="0"/>
+          <w:numId w:val="1"/>
+        </w:numPr>
+        <w:rPr>
+          <w:lang w:val="es-MX"/>
+        </w:rPr>
+      </w:pPr>
+      <w:r>
+        <w:rPr>
+          <w:lang w:val="es-MX"/>
+        </w:rPr>
+        <w:t>Ver listado de restaurantes cercanos</w:t>
+      </w:r>
+    </w:p>
+    <w:p>
+      <w:pPr>
+        <w:pStyle w:val="Prrafodelista"/>
+        <w:numPr>
+          <w:ilvl w:val="0"/>
+          <w:numId w:val="1"/>
+        </w:numPr>
+        <w:rPr>
+          <w:lang w:val="es-MX"/>
+        </w:rPr>
+      </w:pPr>
+      <w:r>
+        <w:rPr>
+          <w:lang w:val="es-MX"/>
+        </w:rPr>
+        <w:t>Ver menú/carta de uno de los restaurantes elegidos</w:t>
+      </w:r>
+    </w:p>
+    <w:p>
+      <w:pPr>
+        <w:pStyle w:val="Prrafodelista"/>
+        <w:numPr>
+          <w:ilvl w:val="0"/>
+          <w:numId w:val="1"/>
+        </w:numPr>
+        <w:rPr>
+          <w:lang w:val="es-MX"/>
+        </w:rPr>
+      </w:pPr>
+      <w:r>
+        <w:rPr>
+          <w:lang w:val="es-MX"/>
+        </w:rPr>
+        <w:t>Agregar los productos al carrito de compras</w:t>
+      </w:r>
+    </w:p>
+    <w:p>
+      <w:pPr>
+        <w:pStyle w:val="Prrafodelista"/>
+        <w:numPr>
+          <w:ilvl w:val="0"/>
+          <w:numId w:val="1"/>
+        </w:numPr>
+        <w:rPr>
+          <w:lang w:val="es-MX"/>
+        </w:rPr>
+      </w:pPr>
+      <w:r>
+        <w:rPr>
+          <w:lang w:val="es-MX"/>
+        </w:rPr>
+        <w:t>Confirmar el pedido</w:t>
+      </w:r>
+    </w:p>
+    <w:p>
+      <w:pPr>
+        <w:pStyle w:val="Prrafodelista"/>
+        <w:numPr>
+          <w:ilvl w:val="0"/>
+          <w:numId w:val="1"/>
+        </w:numPr>
+        <w:rPr>
+          <w:lang w:val="es-MX"/>
+        </w:rPr>
+      </w:pPr>
+      <w:r>
+        <w:rPr>
+          <w:lang w:val="es-MX"/>
+        </w:rPr>
+        <w:t>Genera factura</w:t>
+      </w:r>
+    </w:p>
+    <w:p>
+      <w:pPr>
+        <w:pStyle w:val="Prrafodelista"/>
+        <w:numPr>
+          <w:ilvl w:val="0"/>
+          <w:numId w:val="1"/>
+        </w:numPr>
+        <w:rPr>
+          <w:lang w:val="es-MX"/>
+        </w:rPr>
+      </w:pPr>
+      <w:r>
+        <w:rPr>
+          <w:lang w:val="es-MX"/>
+        </w:rPr>
+        <w:t>Selección método de pago Efectivo</w:t>
+      </w:r>
+    </w:p>
+    <w:p>
+      <w:pPr>
+        <w:pStyle w:val="Prrafodelista"/>
+        <w:numPr>
+          <w:ilvl w:val="0"/>
+          <w:numId w:val="1"/>
+        </w:numPr>
+        <w:rPr>
+          <w:lang w:val="es-MX"/>
+        </w:rPr>
+      </w:pPr>
+      <w:r>
+        <w:rPr>
+          <w:lang w:val="es-MX"/>
+        </w:rPr>
+        <w:t>Selección método de pago Tarjeta</w:t>
+      </w:r>
+    </w:p>
+    <w:p>
+      <w:pPr>
+        <w:pStyle w:val="Prrafodelista"/>
+        <w:numPr>
+          <w:ilvl w:val="0"/>
+          <w:numId w:val="1"/>
+        </w:numPr>
+        <w:rPr>
+          <w:lang w:val="es-MX"/>
+        </w:rPr>
+      </w:pPr>
+      <w:r>
+        <w:rPr>
+          <w:lang w:val="es-MX"/>
+        </w:rPr>
+        <w:t>Revisión de tiempo estimado de recogida</w:t>
+      </w:r>
+    </w:p>
+    <w:p>
+      <w:pPr>
+        <w:pStyle w:val="Prrafodelista"/>
+        <w:numPr>
+          <w:ilvl w:val="0"/>
+          <w:numId w:val="1"/>
+        </w:numPr>
+        <w:rPr>
+          <w:lang w:val="es-MX"/>
+        </w:rPr>
+      </w:pPr>
+      <w:r>
+        <w:rPr>
+          <w:lang w:val="es-MX"/>
+        </w:rPr>
+        <w:t>Recibe código QR de la compra</w:t>
+      </w:r>
+    </w:p>
+    <w:p>
+      <w:pPr>
+        <w:pStyle w:val="Prrafodelista"/>
+        <w:numPr>
+          <w:ilvl w:val="0"/>
+          <w:numId w:val="1"/>
+        </w:numPr>
+        <w:rPr>
+          <w:lang w:val="es-MX"/>
+        </w:rPr>
+      </w:pPr>
+      <w:r>
+        <w:rPr>
+          <w:lang w:val="es-MX"/>
+        </w:rPr>
+        <w:t>Ver historial de pedidos</w:t>
+      </w:r>
+    </w:p>
+    <w:p>
+      <w:pPr>
+        <w:pStyle w:val="Prrafodelista"/>
+        <w:numPr>
+          <w:ilvl w:val="0"/>
+          <w:numId w:val="1"/>
+        </w:numPr>
+        <w:rPr>
+          <w:lang w:val="es-MX"/>
+        </w:rPr>
+      </w:pPr>
+      <w:r>
+        <w:rPr>
+          <w:lang w:val="es-MX"/>
+        </w:rPr>
+        <w:t xml:space="preserve">Editar datos del perfil </w:t>
+      </w:r>
+    </w:p>
+    <w:p>
+      <w:pPr>
+        <w:pStyle w:val="Prrafodelista"/>
+        <w:numPr>
+          <w:ilvl w:val="0"/>
+          <w:numId w:val="1"/>
+        </w:numPr>
+        <w:rPr>
+          <w:lang w:val="es-MX"/>
+        </w:rPr>
+      </w:pPr>
+      <w:r>
+        <w:rPr>
+          <w:lang w:val="es-MX"/>
+        </w:rPr>
+        <w:t>Puntuación y comentarios de comercio según su experiencia</w:t>
+      </w:r>
+    </w:p>
+    <w:p>
+      <w:pPr>
+        <w:rPr>
+          <w:b/>
+          <w:bCs/>
+          <w:lang w:val="es-MX"/>
+        </w:rPr>
+      </w:pPr>
+      <w:r>
+        <w:rPr>
+          <w:b/>
+          <w:bCs/>
+          <w:lang w:val="es-MX"/>
+        </w:rPr>
+        <w:t>Comercio</w:t>
+      </w:r>
+      <w:r>
+        <w:rPr>
+          <w:b/>
+          <w:bCs/>
+          <w:lang w:val="es-MX"/>
+        </w:rPr>
+        <w:t>:</w:t>
+      </w:r>
+    </w:p>
+    <w:p>
+      <w:pPr>
+        <w:pStyle w:val="Prrafodelista"/>
+        <w:numPr>
+          <w:ilvl w:val="0"/>
+          <w:numId w:val="1"/>
+        </w:numPr>
+        <w:rPr>
+          <w:lang w:val="es-MX"/>
+        </w:rPr>
+      </w:pPr>
+      <w:r>
+        <w:rPr>
+          <w:lang w:val="es-MX"/>
+        </w:rPr>
+        <w:t>Iniciar sesión como comerciante</w:t>
+      </w:r>
+    </w:p>
+    <w:p>
+      <w:pPr>
+        <w:pStyle w:val="Prrafodelista"/>
+        <w:numPr>
+          <w:ilvl w:val="0"/>
+          <w:numId w:val="1"/>
+        </w:numPr>
+        <w:rPr>
+          <w:lang w:val="es-MX"/>
+        </w:rPr>
+      </w:pPr>
+      <w:r>
+        <w:rPr>
+          <w:lang w:val="es-MX"/>
+        </w:rPr>
+        <w:t xml:space="preserve">Administración del espacio virtual </w:t>
+      </w:r>
+      <w:r>
+        <w:rPr>
+          <w:lang w:val="es-MX"/>
+        </w:rPr>
+        <w:t>(Perfil)</w:t>
+      </w:r>
+    </w:p>
+    <w:p>
+      <w:pPr>
+        <w:pStyle w:val="Prrafodelista"/>
+        <w:numPr>
+          <w:ilvl w:val="0"/>
+          <w:numId w:val="1"/>
+        </w:numPr>
+        <w:rPr>
+          <w:lang w:val="es-MX"/>
+        </w:rPr>
+      </w:pPr>
+      <w:r>
+        <w:rPr>
+          <w:lang w:val="es-MX"/>
+        </w:rPr>
+        <w:t>Editar información de productos del menú</w:t>
+      </w:r>
+    </w:p>
+    <w:p>
+      <w:pPr>
+        <w:pStyle w:val="Prrafodelista"/>
+        <w:numPr>
+          <w:ilvl w:val="0"/>
+          <w:numId w:val="1"/>
+        </w:numPr>
+        <w:rPr>
+          <w:lang w:val="es-MX"/>
+        </w:rPr>
+      </w:pPr>
+      <w:r>
+        <w:rPr>
+          <w:lang w:val="es-MX"/>
+        </w:rPr>
+        <w:t>Actualización de datos de productos</w:t>
+      </w:r>
+    </w:p>
+    <w:p>
+      <w:pPr>
+        <w:pStyle w:val="Prrafodelista"/>
+        <w:numPr>
+          <w:ilvl w:val="0"/>
+          <w:numId w:val="1"/>
+        </w:numPr>
+        <w:rPr>
+          <w:lang w:val="es-MX"/>
+        </w:rPr>
+      </w:pPr>
+      <w:r>
+        <w:rPr>
+          <w:lang w:val="es-MX"/>
+        </w:rPr>
+        <w:t>Ver pedidos entrantes en tiempo real</w:t>
+      </w:r>
+    </w:p>
+    <w:p>
+      <w:pPr>
+        <w:pStyle w:val="Prrafodelista"/>
+        <w:numPr>
+          <w:ilvl w:val="0"/>
+          <w:numId w:val="1"/>
+        </w:numPr>
+        <w:rPr>
+          <w:lang w:val="es-MX"/>
+        </w:rPr>
+      </w:pPr>
+      <w:r>
+        <w:rPr>
+          <w:lang w:val="es-MX"/>
+        </w:rPr>
+        <w:t>Estimación de tiempos según demanda</w:t>
+      </w:r>
+    </w:p>
+    <w:p>
+      <w:pPr>
+        <w:pStyle w:val="Prrafodelista"/>
+        <w:numPr>
+          <w:ilvl w:val="0"/>
+          <w:numId w:val="1"/>
+        </w:numPr>
+        <w:rPr>
+          <w:lang w:val="es-MX"/>
+        </w:rPr>
+      </w:pPr>
+      <w:r>
+        <w:rPr>
+          <w:lang w:val="es-MX"/>
+        </w:rPr>
+        <w:t>Marcación de pedidos listos</w:t>
+      </w:r>
+    </w:p>
+    <w:p>
+      <w:pPr>
+        <w:pStyle w:val="Prrafodelista"/>
+        <w:numPr>
+          <w:ilvl w:val="0"/>
+          <w:numId w:val="1"/>
+        </w:numPr>
+        <w:rPr>
+          <w:lang w:val="es-MX"/>
+        </w:rPr>
+      </w:pPr>
+      <w:r>
+        <w:rPr>
+          <w:lang w:val="es-MX"/>
+        </w:rPr>
+        <w:t>Confirmar método de pago</w:t>
+      </w:r>
+    </w:p>
+    <w:p>
+      <w:pPr>
+        <w:pStyle w:val="Prrafodelista"/>
+        <w:numPr>
+          <w:ilvl w:val="0"/>
+          <w:numId w:val="1"/>
+        </w:numPr>
+        <w:rPr>
+          <w:lang w:val="es-MX"/>
+        </w:rPr>
+      </w:pPr>
+      <w:r>
+        <w:rPr>
+          <w:lang w:val="es-MX"/>
+        </w:rPr>
+        <w:t>Escaneo QR</w:t>
+      </w:r>
+    </w:p>
+    <w:p>
+      <w:pPr>
+        <w:pStyle w:val="Prrafodelista"/>
+        <w:numPr>
+          <w:ilvl w:val="0"/>
+          <w:numId w:val="1"/>
+        </w:numPr>
+        <w:rPr>
+          <w:lang w:val="es-MX"/>
+        </w:rPr>
+      </w:pPr>
+      <w:r>
+        <w:rPr>
+          <w:lang w:val="es-MX"/>
+        </w:rPr>
+        <w:t>Puntuación y comentarios de usuario según su historial de pago</w:t>
+      </w:r>
+    </w:p>
+    <w:p>
+      <w:pPr>
+        <w:pStyle w:val="Prrafodelista"/>
+        <w:numPr>
+          <w:ilvl w:val="0"/>
+          <w:numId w:val="1"/>
+        </w:numPr>
+        <w:rPr>
+          <w:lang w:val="es-MX"/>
+        </w:rPr>
+      </w:pPr>
+      <w:r>
+        <w:rPr>
+          <w:lang w:val="es-MX"/>
+        </w:rPr>
+        <w:t>Reporte de datos</w:t>
+      </w:r>
+    </w:p>
+    <w:p>
+      <w:pPr>
+        <w:rPr>
+          <w:b/>
+          <w:bCs/>
+          <w:lang w:val="es-MX"/>
+        </w:rPr>
+      </w:pPr>
+      <w:r>
+        <w:rPr>
+          <w:b/>
+          <w:bCs/>
+          <w:lang w:val="es-MX"/>
+        </w:rPr>
+        <w:t>Admin:</w:t>
+      </w:r>
+    </w:p>
+    <w:p>
+      <w:pPr>
+        <w:pStyle w:val="Prrafodelista"/>
+        <w:numPr>
+          <w:ilvl w:val="0"/>
+          <w:numId w:val="1"/>
+        </w:numPr>
+        <w:rPr>
+          <w:lang w:val="es-MX"/>
+        </w:rPr>
+      </w:pPr>
+      <w:r>
+        <w:rPr>
+          <w:lang w:val="es-MX"/>
+        </w:rPr>
+        <w:lastRenderedPageBreak/>
+        <w:t>Inicio de sesión como administrador</w:t>
+      </w:r>
+    </w:p>
+    <w:p>
+      <w:pPr>
+        <w:pStyle w:val="Prrafodelista"/>
+        <w:numPr>
+          <w:ilvl w:val="0"/>
+          <w:numId w:val="1"/>
+        </w:numPr>
+        <w:rPr>
+          <w:lang w:val="es-MX"/>
+        </w:rPr>
+      </w:pPr>
+      <w:r>
+        <w:rPr>
+          <w:lang w:val="es-MX"/>
+        </w:rPr>
+        <w:t>Revisión de requisitos mínimos para afiliación</w:t>
+      </w:r>
+    </w:p>
+    <w:p>
+      <w:pPr>
+        <w:pStyle w:val="Prrafodelista"/>
+        <w:numPr>
+          <w:ilvl w:val="0"/>
+          <w:numId w:val="1"/>
+        </w:numPr>
+        <w:rPr>
+          <w:lang w:val="es-MX"/>
+        </w:rPr>
+      </w:pPr>
+      <w:r>
+        <w:rPr>
+          <w:lang w:val="es-MX"/>
+        </w:rPr>
+        <w:t>Creación de perfil del comercio / usuario</w:t>
+      </w:r>
+    </w:p>
+    <w:p>
+      <w:pPr>
+        <w:pStyle w:val="Prrafodelista"/>
+        <w:numPr>
+          <w:ilvl w:val="0"/>
+          <w:numId w:val="1"/>
+        </w:numPr>
+        <w:rPr>
+          <w:lang w:val="es-MX"/>
+        </w:rPr>
+      </w:pPr>
+      <w:r>
+        <w:rPr>
+          <w:lang w:val="es-MX"/>
+        </w:rPr>
+        <w:t>Activación de perfiles de comercio / usuario</w:t>
+      </w:r>
+    </w:p>
+    <w:p>
+      <w:pPr>
+        <w:pStyle w:val="Prrafodelista"/>
+        <w:numPr>
+          <w:ilvl w:val="0"/>
+          <w:numId w:val="1"/>
+        </w:numPr>
+        <w:rPr>
+          <w:lang w:val="es-MX"/>
+        </w:rPr>
+      </w:pPr>
+      <w:r>
+        <w:rPr>
+          <w:lang w:val="es-MX"/>
+        </w:rPr>
+        <w:t>Desactivación de perfiles de comercio / usuario</w:t>
+      </w:r>
+    </w:p>
+    <w:p>
+      <w:pPr>
+        <w:pStyle w:val="Prrafodelista"/>
+        <w:numPr>
+          <w:ilvl w:val="0"/>
+          <w:numId w:val="1"/>
+        </w:numPr>
+        <w:rPr>
+          <w:lang w:val="es-MX"/>
+        </w:rPr>
+      </w:pPr>
+      <w:r>
+        <w:rPr>
+          <w:lang w:val="es-MX"/>
+        </w:rPr>
+        <w:t>Ver reportes de actividad de plataforma</w:t>
+      </w:r>
+    </w:p>
+    <w:p>
+      <w:pPr>
+        <w:rPr>
+          <w:b/>
+          <w:bCs/>
+          <w:lang w:val="es-MX"/>
+        </w:rPr>
+      </w:pPr>
+      <w:r>
+        <w:rPr>
+          <w:b/>
+          <w:bCs/>
+          <w:lang w:val="es-MX"/>
+        </w:rPr>
+        <w:t>Product Backlog:</w:t>
+      </w:r>
     </w:p>
     <w:p>
       <w:pPr>
@@ -161,24 +797,6 @@
           <w:lang w:val="es-MX"/>
         </w:rPr>
       </w:pPr>
-      <w:proofErr w:type="spellStart"/>
-      <w:r>
-        <w:rPr>
-          <w:b/>
-          <w:bCs/>
-          <w:lang w:val="es-MX"/>
-        </w:rPr>
-        <w:t>Product</w:t>
-      </w:r>
-      <w:proofErr w:type="spellEnd"/>
-      <w:r>
-        <w:rPr>
-          <w:b/>
-          <w:bCs/>
-          <w:lang w:val="es-MX"/>
-        </w:rPr>
-        <w:t xml:space="preserve"> Backlog:</w:t>
-      </w:r>
     </w:p>
     <w:p>
       <w:pPr>
@@ -202,6 +820,103 @@
     </w:sectPr>
   </w:body>
 </w:document>
+</file>
+
+<file path=word/numbering.xml><?xml version="1.0" encoding="utf-8"?>
+<w:numbering xmlns:wpc="http://schemas.microsoft.com/office/word/2010/wordprocessingCanvas" xmlns:cx="http://schemas.microsoft.com/office/drawing/2014/chartex" xmlns:cx1="http://schemas.microsoft.com/office/drawing/2015/9/8/chartex" xmlns:cx2="http://schemas.microsoft.com/office/drawing/2015/10/21/chartex" xmlns:cx3="http://schemas.microsoft.com/office/drawing/2016/5/9/chartex" xmlns:cx4="http://schemas.microsoft.com/office/drawing/2016/5/10/chartex" xmlns:cx5="http://schemas.microsoft.com/office/drawing/2016/5/11/chartex" xmlns:cx6="http://schemas.microsoft.com/office/drawing/2016/5/12/chartex" xmlns:cx7="http://schemas.microsoft.com/office/drawing/2016/5/13/chartex" xmlns:cx8="http://schemas.microsoft.com/office/drawing/2016/5/14/chartex" xmlns:mc="http://schemas.openxmlformats.org/markup-compatibility/2006" xmlns:aink="http://schemas.microsoft.com/office/drawing/2016/ink" xmlns:am3d="http://schemas.microsoft.com/office/drawing/2017/model3d" xmlns:o="urn:schemas-microsoft-com:office:office" xmlns:oel="http://schemas.microsoft.com/office/2019/extlst" xmlns:r="http://schemas.openxmlformats.org/officeDocument/2006/relationships" xmlns:m="http://schemas.openxmlformats.org/officeDocument/2006/math" xmlns:v="urn:schemas-microsoft-com:vml" xmlns:wp14="http://schemas.microsoft.com/office/word/2010/wordprocessingDrawing" xmlns:wp="http://schemas.openxmlformats.org/drawingml/2006/wordprocessingDrawing" xmlns:w10="urn:schemas-microsoft-com:office:word" xmlns:w="http://schemas.openxmlformats.org/wordprocessingml/2006/main" xmlns:w14="http://schemas.microsoft.com/office/word/2010/wordml" xmlns:w15="http://schemas.microsoft.com/office/word/2012/wordml" xmlns:w16cex="http://schemas.microsoft.com/office/word/2018/wordml/cex" xmlns:w16cid="http://schemas.microsoft.com/office/word/2016/wordml/cid" xmlns:w16="http://schemas.microsoft.com/office/word/2018/wordml" xmlns:w16du="http://schemas.microsoft.com/office/word/2023/wordml/word16du" xmlns:w16sdtdh="http://schemas.microsoft.com/office/word/2020/wordml/sdtdatahash" xmlns:w16sdtfl="http://schemas.microsoft.com/office/word/2024/wordml/sdtformatlock" xmlns:w16se="http://schemas.microsoft.com/office/word/2015/wordml/symex" xmlns:wpg="http://schemas.microsoft.com/office/word/2010/wordprocessingGroup" xmlns:wpi="http://schemas.microsoft.com/office/word/2010/wordprocessingInk" xmlns:wne="http://schemas.microsoft.com/office/word/2006/wordml" xmlns:wps="http://schemas.microsoft.com/office/word/2010/wordprocessingShape" mc:Ignorable="w14 w15 w16se w16cid w16 w16cex w16sdtdh w16sdtfl w16du wp14">
+  <w:abstractNum w:abstractNumId="0" w15:restartNumberingAfterBreak="0">
+    <w:nsid w:val="2D107A0B"/>
+    <w:multiLevelType w:val="hybridMultilevel"/>
+    <w:tmpl w:val="2ED6557C"/>
+    <w:lvl w:ilvl="0" w:tplc="240A000F">
+      <w:start w:val="1"/>
+      <w:numFmt w:val="decimal"/>
+      <w:lvlText w:val="%1."/>
+      <w:lvlJc w:val="left"/>
+      <w:pPr>
+        <w:ind w:left="720" w:hanging="360"/>
+      </w:pPr>
+      <w:rPr>
+        <w:rFonts w:hint="default"/>
+      </w:rPr>
+    </w:lvl>
+    <w:lvl w:ilvl="1" w:tplc="240A0019" w:tentative="1">
+      <w:start w:val="1"/>
+      <w:numFmt w:val="lowerLetter"/>
+      <w:lvlText w:val="%2."/>
+      <w:lvlJc w:val="left"/>
+      <w:pPr>
+        <w:ind w:left="1440" w:hanging="360"/>
+      </w:pPr>
+    </w:lvl>
+    <w:lvl w:ilvl="2" w:tplc="240A001B" w:tentative="1">
+      <w:start w:val="1"/>
+      <w:numFmt w:val="lowerRoman"/>
+      <w:lvlText w:val="%3."/>
+      <w:lvlJc w:val="right"/>
+      <w:pPr>
+        <w:ind w:left="2160" w:hanging="180"/>
+      </w:pPr>
+    </w:lvl>
+    <w:lvl w:ilvl="3" w:tplc="240A000F" w:tentative="1">
+      <w:start w:val="1"/>
+      <w:numFmt w:val="decimal"/>
+      <w:lvlText w:val="%4."/>
+      <w:lvlJc w:val="left"/>
+      <w:pPr>
+        <w:ind w:left="2880" w:hanging="360"/>
+      </w:pPr>
+    </w:lvl>
+    <w:lvl w:ilvl="4" w:tplc="240A0019" w:tentative="1">
+      <w:start w:val="1"/>
+      <w:numFmt w:val="lowerLetter"/>
+      <w:lvlText w:val="%5."/>
+      <w:lvlJc w:val="left"/>
+      <w:pPr>
+        <w:ind w:left="3600" w:hanging="360"/>
+      </w:pPr>
+    </w:lvl>
+    <w:lvl w:ilvl="5" w:tplc="240A001B" w:tentative="1">
+      <w:start w:val="1"/>
+      <w:numFmt w:val="lowerRoman"/>
+      <w:lvlText w:val="%6."/>
+      <w:lvlJc w:val="right"/>
+      <w:pPr>
+        <w:ind w:left="4320" w:hanging="180"/>
+      </w:pPr>
+    </w:lvl>
+    <w:lvl w:ilvl="6" w:tplc="240A000F" w:tentative="1">
+      <w:start w:val="1"/>
+      <w:numFmt w:val="decimal"/>
+      <w:lvlText w:val="%7."/>
+      <w:lvlJc w:val="left"/>
+      <w:pPr>
+        <w:ind w:left="5040" w:hanging="360"/>
+      </w:pPr>
+    </w:lvl>
+    <w:lvl w:ilvl="7" w:tplc="240A0019" w:tentative="1">
+      <w:start w:val="1"/>
+      <w:numFmt w:val="lowerLetter"/>
+      <w:lvlText w:val="%8."/>
+      <w:lvlJc w:val="left"/>
+      <w:pPr>
+        <w:ind w:left="5760" w:hanging="360"/>
+      </w:pPr>
+    </w:lvl>
+    <w:lvl w:ilvl="8" w:tplc="240A001B" w:tentative="1">
+      <w:start w:val="1"/>
+      <w:numFmt w:val="lowerRoman"/>
+      <w:lvlText w:val="%9."/>
+      <w:lvlJc w:val="right"/>
+      <w:pPr>
+        <w:ind w:left="6480" w:hanging="180"/>
+      </w:pPr>
+    </w:lvl>
+  </w:abstractNum>
+  <w:num w:numId="1" w16cid:durableId="1880121857">
+    <w:abstractNumId w:val="0"/>
+  </w:num>
+</w:numbering>
 </file>
 
 <file path=word/styles.xml><?xml version="1.0" encoding="utf-8"?>

</xml_diff>